<commit_message>
final updation after modifications
</commit_message>
<xml_diff>
--- a/Documents/Book_a_Doctor_App_Documentation_Final_1.docx
+++ b/Documents/Book_a_Doctor_App_Documentation_Final_1.docx
@@ -4388,12 +4388,6 @@
         <w:gridCol w:w="4000"/>
       </w:tblGrid>
       <w:tr>
-        <w:tblPrEx>
-          <w:tblCellMar>
-            <w:top w:w="0" w:type="dxa"/>
-            <w:bottom w:w="0" w:type="dxa"/>
-          </w:tblCellMar>
-        </w:tblPrEx>
         <w:trPr>
           <w:cantSplit/>
           <w:tblHeader/>
@@ -4450,12 +4444,6 @@
         </w:tc>
       </w:tr>
       <w:tr>
-        <w:tblPrEx>
-          <w:tblCellMar>
-            <w:top w:w="0" w:type="dxa"/>
-            <w:bottom w:w="0" w:type="dxa"/>
-          </w:tblCellMar>
-        </w:tblPrEx>
         <w:trPr>
           <w:cantSplit/>
         </w:trPr>
@@ -4506,12 +4494,6 @@
         </w:tc>
       </w:tr>
       <w:tr>
-        <w:tblPrEx>
-          <w:tblCellMar>
-            <w:top w:w="0" w:type="dxa"/>
-            <w:bottom w:w="0" w:type="dxa"/>
-          </w:tblCellMar>
-        </w:tblPrEx>
         <w:trPr>
           <w:cantSplit/>
         </w:trPr>
@@ -4562,12 +4544,6 @@
         </w:tc>
       </w:tr>
       <w:tr>
-        <w:tblPrEx>
-          <w:tblCellMar>
-            <w:top w:w="0" w:type="dxa"/>
-            <w:bottom w:w="0" w:type="dxa"/>
-          </w:tblCellMar>
-        </w:tblPrEx>
         <w:trPr>
           <w:cantSplit/>
         </w:trPr>
@@ -4618,12 +4594,6 @@
         </w:tc>
       </w:tr>
       <w:tr>
-        <w:tblPrEx>
-          <w:tblCellMar>
-            <w:top w:w="0" w:type="dxa"/>
-            <w:bottom w:w="0" w:type="dxa"/>
-          </w:tblCellMar>
-        </w:tblPrEx>
         <w:trPr>
           <w:cantSplit/>
         </w:trPr>
@@ -4674,12 +4644,6 @@
         </w:tc>
       </w:tr>
       <w:tr>
-        <w:tblPrEx>
-          <w:tblCellMar>
-            <w:top w:w="0" w:type="dxa"/>
-            <w:bottom w:w="0" w:type="dxa"/>
-          </w:tblCellMar>
-        </w:tblPrEx>
         <w:trPr>
           <w:cantSplit/>
         </w:trPr>
@@ -5151,12 +5115,6 @@
         <w:gridCol w:w="6500"/>
       </w:tblGrid>
       <w:tr>
-        <w:tblPrEx>
-          <w:tblCellMar>
-            <w:top w:w="0" w:type="dxa"/>
-            <w:bottom w:w="0" w:type="dxa"/>
-          </w:tblCellMar>
-        </w:tblPrEx>
         <w:trPr>
           <w:cantSplit/>
           <w:tblHeader/>
@@ -5213,12 +5171,6 @@
         </w:tc>
       </w:tr>
       <w:tr>
-        <w:tblPrEx>
-          <w:tblCellMar>
-            <w:top w:w="0" w:type="dxa"/>
-            <w:bottom w:w="0" w:type="dxa"/>
-          </w:tblCellMar>
-        </w:tblPrEx>
         <w:trPr>
           <w:cantSplit/>
         </w:trPr>
@@ -5269,12 +5221,6 @@
         </w:tc>
       </w:tr>
       <w:tr>
-        <w:tblPrEx>
-          <w:tblCellMar>
-            <w:top w:w="0" w:type="dxa"/>
-            <w:bottom w:w="0" w:type="dxa"/>
-          </w:tblCellMar>
-        </w:tblPrEx>
         <w:trPr>
           <w:cantSplit/>
         </w:trPr>
@@ -5325,12 +5271,6 @@
         </w:tc>
       </w:tr>
       <w:tr>
-        <w:tblPrEx>
-          <w:tblCellMar>
-            <w:top w:w="0" w:type="dxa"/>
-            <w:bottom w:w="0" w:type="dxa"/>
-          </w:tblCellMar>
-        </w:tblPrEx>
         <w:trPr>
           <w:cantSplit/>
         </w:trPr>
@@ -5936,12 +5876,6 @@
         <w:gridCol w:w="3000"/>
       </w:tblGrid>
       <w:tr>
-        <w:tblPrEx>
-          <w:tblCellMar>
-            <w:top w:w="0" w:type="dxa"/>
-            <w:bottom w:w="0" w:type="dxa"/>
-          </w:tblCellMar>
-        </w:tblPrEx>
         <w:trPr>
           <w:cantSplit/>
           <w:tblHeader/>
@@ -6023,12 +5957,6 @@
         </w:tc>
       </w:tr>
       <w:tr>
-        <w:tblPrEx>
-          <w:tblCellMar>
-            <w:top w:w="0" w:type="dxa"/>
-            <w:bottom w:w="0" w:type="dxa"/>
-          </w:tblCellMar>
-        </w:tblPrEx>
         <w:trPr>
           <w:cantSplit/>
         </w:trPr>
@@ -6101,12 +6029,6 @@
         </w:tc>
       </w:tr>
       <w:tr>
-        <w:tblPrEx>
-          <w:tblCellMar>
-            <w:top w:w="0" w:type="dxa"/>
-            <w:bottom w:w="0" w:type="dxa"/>
-          </w:tblCellMar>
-        </w:tblPrEx>
         <w:trPr>
           <w:cantSplit/>
         </w:trPr>
@@ -6190,12 +6112,6 @@
         </w:tc>
       </w:tr>
       <w:tr>
-        <w:tblPrEx>
-          <w:tblCellMar>
-            <w:top w:w="0" w:type="dxa"/>
-            <w:bottom w:w="0" w:type="dxa"/>
-          </w:tblCellMar>
-        </w:tblPrEx>
         <w:trPr>
           <w:cantSplit/>
         </w:trPr>
@@ -6319,12 +6235,6 @@
         </w:tc>
       </w:tr>
       <w:tr>
-        <w:tblPrEx>
-          <w:tblCellMar>
-            <w:top w:w="0" w:type="dxa"/>
-            <w:bottom w:w="0" w:type="dxa"/>
-          </w:tblCellMar>
-        </w:tblPrEx>
         <w:trPr>
           <w:cantSplit/>
         </w:trPr>
@@ -6468,12 +6378,6 @@
         </w:tc>
       </w:tr>
       <w:tr>
-        <w:tblPrEx>
-          <w:tblCellMar>
-            <w:top w:w="0" w:type="dxa"/>
-            <w:bottom w:w="0" w:type="dxa"/>
-          </w:tblCellMar>
-        </w:tblPrEx>
         <w:trPr>
           <w:cantSplit/>
         </w:trPr>
@@ -7525,12 +7429,6 @@
         <w:gridCol w:w="2452"/>
       </w:tblGrid>
       <w:tr>
-        <w:tblPrEx>
-          <w:tblCellMar>
-            <w:top w:w="0" w:type="dxa"/>
-            <w:bottom w:w="0" w:type="dxa"/>
-          </w:tblCellMar>
-        </w:tblPrEx>
         <w:trPr>
           <w:cantSplit/>
           <w:tblHeader/>
@@ -7613,12 +7511,6 @@
         </w:tc>
       </w:tr>
       <w:tr>
-        <w:tblPrEx>
-          <w:tblCellMar>
-            <w:top w:w="0" w:type="dxa"/>
-            <w:bottom w:w="0" w:type="dxa"/>
-          </w:tblCellMar>
-        </w:tblPrEx>
         <w:trPr>
           <w:cantSplit/>
         </w:trPr>
@@ -7719,12 +7611,6 @@
         </w:tc>
       </w:tr>
       <w:tr>
-        <w:tblPrEx>
-          <w:tblCellMar>
-            <w:top w:w="0" w:type="dxa"/>
-            <w:bottom w:w="0" w:type="dxa"/>
-          </w:tblCellMar>
-        </w:tblPrEx>
         <w:trPr>
           <w:cantSplit/>
         </w:trPr>
@@ -7815,12 +7701,6 @@
         </w:tc>
       </w:tr>
       <w:tr>
-        <w:tblPrEx>
-          <w:tblCellMar>
-            <w:top w:w="0" w:type="dxa"/>
-            <w:bottom w:w="0" w:type="dxa"/>
-          </w:tblCellMar>
-        </w:tblPrEx>
         <w:trPr>
           <w:cantSplit/>
         </w:trPr>
@@ -7893,12 +7773,6 @@
         </w:tc>
       </w:tr>
       <w:tr>
-        <w:tblPrEx>
-          <w:tblCellMar>
-            <w:top w:w="0" w:type="dxa"/>
-            <w:bottom w:w="0" w:type="dxa"/>
-          </w:tblCellMar>
-        </w:tblPrEx>
         <w:trPr>
           <w:cantSplit/>
         </w:trPr>
@@ -7971,12 +7845,6 @@
         </w:tc>
       </w:tr>
       <w:tr>
-        <w:tblPrEx>
-          <w:tblCellMar>
-            <w:top w:w="0" w:type="dxa"/>
-            <w:bottom w:w="0" w:type="dxa"/>
-          </w:tblCellMar>
-        </w:tblPrEx>
         <w:trPr>
           <w:cantSplit/>
         </w:trPr>
@@ -8049,12 +7917,6 @@
         </w:tc>
       </w:tr>
       <w:tr>
-        <w:tblPrEx>
-          <w:tblCellMar>
-            <w:top w:w="0" w:type="dxa"/>
-            <w:bottom w:w="0" w:type="dxa"/>
-          </w:tblCellMar>
-        </w:tblPrEx>
         <w:trPr>
           <w:cantSplit/>
         </w:trPr>
@@ -9463,12 +9325,6 @@
         <w:gridCol w:w="1700"/>
       </w:tblGrid>
       <w:tr>
-        <w:tblPrEx>
-          <w:tblCellMar>
-            <w:top w:w="0" w:type="dxa"/>
-            <w:bottom w:w="0" w:type="dxa"/>
-          </w:tblCellMar>
-        </w:tblPrEx>
         <w:trPr>
           <w:cantSplit/>
           <w:tblHeader/>
@@ -9550,12 +9406,6 @@
         </w:tc>
       </w:tr>
       <w:tr>
-        <w:tblPrEx>
-          <w:tblCellMar>
-            <w:top w:w="0" w:type="dxa"/>
-            <w:bottom w:w="0" w:type="dxa"/>
-          </w:tblCellMar>
-        </w:tblPrEx>
         <w:trPr>
           <w:cantSplit/>
         </w:trPr>
@@ -9646,12 +9496,6 @@
         </w:tc>
       </w:tr>
       <w:tr>
-        <w:tblPrEx>
-          <w:tblCellMar>
-            <w:top w:w="0" w:type="dxa"/>
-            <w:bottom w:w="0" w:type="dxa"/>
-          </w:tblCellMar>
-        </w:tblPrEx>
         <w:trPr>
           <w:cantSplit/>
         </w:trPr>
@@ -9742,12 +9586,6 @@
         </w:tc>
       </w:tr>
       <w:tr>
-        <w:tblPrEx>
-          <w:tblCellMar>
-            <w:top w:w="0" w:type="dxa"/>
-            <w:bottom w:w="0" w:type="dxa"/>
-          </w:tblCellMar>
-        </w:tblPrEx>
         <w:trPr>
           <w:cantSplit/>
         </w:trPr>
@@ -9838,12 +9676,6 @@
         </w:tc>
       </w:tr>
       <w:tr>
-        <w:tblPrEx>
-          <w:tblCellMar>
-            <w:top w:w="0" w:type="dxa"/>
-            <w:bottom w:w="0" w:type="dxa"/>
-          </w:tblCellMar>
-        </w:tblPrEx>
         <w:trPr>
           <w:cantSplit/>
         </w:trPr>
@@ -9980,12 +9812,6 @@
         <w:gridCol w:w="1700"/>
       </w:tblGrid>
       <w:tr>
-        <w:tblPrEx>
-          <w:tblCellMar>
-            <w:top w:w="0" w:type="dxa"/>
-            <w:bottom w:w="0" w:type="dxa"/>
-          </w:tblCellMar>
-        </w:tblPrEx>
         <w:trPr>
           <w:cantSplit/>
           <w:tblHeader/>
@@ -10067,12 +9893,6 @@
         </w:tc>
       </w:tr>
       <w:tr>
-        <w:tblPrEx>
-          <w:tblCellMar>
-            <w:top w:w="0" w:type="dxa"/>
-            <w:bottom w:w="0" w:type="dxa"/>
-          </w:tblCellMar>
-        </w:tblPrEx>
         <w:trPr>
           <w:cantSplit/>
         </w:trPr>
@@ -10163,12 +9983,6 @@
         </w:tc>
       </w:tr>
       <w:tr>
-        <w:tblPrEx>
-          <w:tblCellMar>
-            <w:top w:w="0" w:type="dxa"/>
-            <w:bottom w:w="0" w:type="dxa"/>
-          </w:tblCellMar>
-        </w:tblPrEx>
         <w:trPr>
           <w:cantSplit/>
         </w:trPr>
@@ -10259,12 +10073,6 @@
         </w:tc>
       </w:tr>
       <w:tr>
-        <w:tblPrEx>
-          <w:tblCellMar>
-            <w:top w:w="0" w:type="dxa"/>
-            <w:bottom w:w="0" w:type="dxa"/>
-          </w:tblCellMar>
-        </w:tblPrEx>
         <w:trPr>
           <w:cantSplit/>
         </w:trPr>
@@ -10355,12 +10163,6 @@
         </w:tc>
       </w:tr>
       <w:tr>
-        <w:tblPrEx>
-          <w:tblCellMar>
-            <w:top w:w="0" w:type="dxa"/>
-            <w:bottom w:w="0" w:type="dxa"/>
-          </w:tblCellMar>
-        </w:tblPrEx>
         <w:trPr>
           <w:cantSplit/>
         </w:trPr>
@@ -10497,12 +10299,6 @@
         <w:gridCol w:w="1700"/>
       </w:tblGrid>
       <w:tr>
-        <w:tblPrEx>
-          <w:tblCellMar>
-            <w:top w:w="0" w:type="dxa"/>
-            <w:bottom w:w="0" w:type="dxa"/>
-          </w:tblCellMar>
-        </w:tblPrEx>
         <w:trPr>
           <w:cantSplit/>
           <w:tblHeader/>
@@ -10584,12 +10380,6 @@
         </w:tc>
       </w:tr>
       <w:tr>
-        <w:tblPrEx>
-          <w:tblCellMar>
-            <w:top w:w="0" w:type="dxa"/>
-            <w:bottom w:w="0" w:type="dxa"/>
-          </w:tblCellMar>
-        </w:tblPrEx>
         <w:trPr>
           <w:cantSplit/>
         </w:trPr>
@@ -10680,12 +10470,6 @@
         </w:tc>
       </w:tr>
       <w:tr>
-        <w:tblPrEx>
-          <w:tblCellMar>
-            <w:top w:w="0" w:type="dxa"/>
-            <w:bottom w:w="0" w:type="dxa"/>
-          </w:tblCellMar>
-        </w:tblPrEx>
         <w:trPr>
           <w:cantSplit/>
         </w:trPr>
@@ -10776,12 +10560,6 @@
         </w:tc>
       </w:tr>
       <w:tr>
-        <w:tblPrEx>
-          <w:tblCellMar>
-            <w:top w:w="0" w:type="dxa"/>
-            <w:bottom w:w="0" w:type="dxa"/>
-          </w:tblCellMar>
-        </w:tblPrEx>
         <w:trPr>
           <w:cantSplit/>
         </w:trPr>
@@ -10872,12 +10650,6 @@
         </w:tc>
       </w:tr>
       <w:tr>
-        <w:tblPrEx>
-          <w:tblCellMar>
-            <w:top w:w="0" w:type="dxa"/>
-            <w:bottom w:w="0" w:type="dxa"/>
-          </w:tblCellMar>
-        </w:tblPrEx>
         <w:trPr>
           <w:cantSplit/>
         </w:trPr>
@@ -10968,12 +10740,6 @@
         </w:tc>
       </w:tr>
       <w:tr>
-        <w:tblPrEx>
-          <w:tblCellMar>
-            <w:top w:w="0" w:type="dxa"/>
-            <w:bottom w:w="0" w:type="dxa"/>
-          </w:tblCellMar>
-        </w:tblPrEx>
         <w:trPr>
           <w:cantSplit/>
         </w:trPr>
@@ -11111,12 +10877,6 @@
         <w:gridCol w:w="1700"/>
       </w:tblGrid>
       <w:tr>
-        <w:tblPrEx>
-          <w:tblCellMar>
-            <w:top w:w="0" w:type="dxa"/>
-            <w:bottom w:w="0" w:type="dxa"/>
-          </w:tblCellMar>
-        </w:tblPrEx>
         <w:trPr>
           <w:cantSplit/>
           <w:tblHeader/>
@@ -11198,12 +10958,6 @@
         </w:tc>
       </w:tr>
       <w:tr>
-        <w:tblPrEx>
-          <w:tblCellMar>
-            <w:top w:w="0" w:type="dxa"/>
-            <w:bottom w:w="0" w:type="dxa"/>
-          </w:tblCellMar>
-        </w:tblPrEx>
         <w:trPr>
           <w:cantSplit/>
         </w:trPr>
@@ -11294,12 +11048,6 @@
         </w:tc>
       </w:tr>
       <w:tr>
-        <w:tblPrEx>
-          <w:tblCellMar>
-            <w:top w:w="0" w:type="dxa"/>
-            <w:bottom w:w="0" w:type="dxa"/>
-          </w:tblCellMar>
-        </w:tblPrEx>
         <w:trPr>
           <w:cantSplit/>
         </w:trPr>
@@ -11410,12 +11158,6 @@
         </w:tc>
       </w:tr>
       <w:tr>
-        <w:tblPrEx>
-          <w:tblCellMar>
-            <w:top w:w="0" w:type="dxa"/>
-            <w:bottom w:w="0" w:type="dxa"/>
-          </w:tblCellMar>
-        </w:tblPrEx>
         <w:trPr>
           <w:cantSplit/>
         </w:trPr>
@@ -11552,12 +11294,6 @@
         <w:gridCol w:w="1700"/>
       </w:tblGrid>
       <w:tr>
-        <w:tblPrEx>
-          <w:tblCellMar>
-            <w:top w:w="0" w:type="dxa"/>
-            <w:bottom w:w="0" w:type="dxa"/>
-          </w:tblCellMar>
-        </w:tblPrEx>
         <w:trPr>
           <w:cantSplit/>
           <w:tblHeader/>
@@ -11639,12 +11375,6 @@
         </w:tc>
       </w:tr>
       <w:tr>
-        <w:tblPrEx>
-          <w:tblCellMar>
-            <w:top w:w="0" w:type="dxa"/>
-            <w:bottom w:w="0" w:type="dxa"/>
-          </w:tblCellMar>
-        </w:tblPrEx>
         <w:trPr>
           <w:cantSplit/>
         </w:trPr>
@@ -11735,12 +11465,6 @@
         </w:tc>
       </w:tr>
       <w:tr>
-        <w:tblPrEx>
-          <w:tblCellMar>
-            <w:top w:w="0" w:type="dxa"/>
-            <w:bottom w:w="0" w:type="dxa"/>
-          </w:tblCellMar>
-        </w:tblPrEx>
         <w:trPr>
           <w:cantSplit/>
         </w:trPr>
@@ -11831,12 +11555,6 @@
         </w:tc>
       </w:tr>
       <w:tr>
-        <w:tblPrEx>
-          <w:tblCellMar>
-            <w:top w:w="0" w:type="dxa"/>
-            <w:bottom w:w="0" w:type="dxa"/>
-          </w:tblCellMar>
-        </w:tblPrEx>
         <w:trPr>
           <w:cantSplit/>
         </w:trPr>
@@ -11927,12 +11645,6 @@
         </w:tc>
       </w:tr>
       <w:tr>
-        <w:tblPrEx>
-          <w:tblCellMar>
-            <w:top w:w="0" w:type="dxa"/>
-            <w:bottom w:w="0" w:type="dxa"/>
-          </w:tblCellMar>
-        </w:tblPrEx>
         <w:trPr>
           <w:cantSplit/>
         </w:trPr>
@@ -12473,12 +12185,6 @@
         <w:gridCol w:w="6500"/>
       </w:tblGrid>
       <w:tr>
-        <w:tblPrEx>
-          <w:tblCellMar>
-            <w:top w:w="0" w:type="dxa"/>
-            <w:bottom w:w="0" w:type="dxa"/>
-          </w:tblCellMar>
-        </w:tblPrEx>
         <w:trPr>
           <w:cantSplit/>
           <w:tblHeader/>
@@ -12535,12 +12241,6 @@
         </w:tc>
       </w:tr>
       <w:tr>
-        <w:tblPrEx>
-          <w:tblCellMar>
-            <w:top w:w="0" w:type="dxa"/>
-            <w:bottom w:w="0" w:type="dxa"/>
-          </w:tblCellMar>
-        </w:tblPrEx>
         <w:trPr>
           <w:cantSplit/>
         </w:trPr>
@@ -12591,12 +12291,6 @@
         </w:tc>
       </w:tr>
       <w:tr>
-        <w:tblPrEx>
-          <w:tblCellMar>
-            <w:top w:w="0" w:type="dxa"/>
-            <w:bottom w:w="0" w:type="dxa"/>
-          </w:tblCellMar>
-        </w:tblPrEx>
         <w:trPr>
           <w:cantSplit/>
         </w:trPr>
@@ -12647,12 +12341,6 @@
         </w:tc>
       </w:tr>
       <w:tr>
-        <w:tblPrEx>
-          <w:tblCellMar>
-            <w:top w:w="0" w:type="dxa"/>
-            <w:bottom w:w="0" w:type="dxa"/>
-          </w:tblCellMar>
-        </w:tblPrEx>
         <w:trPr>
           <w:cantSplit/>
         </w:trPr>
@@ -12703,12 +12391,6 @@
         </w:tc>
       </w:tr>
       <w:tr>
-        <w:tblPrEx>
-          <w:tblCellMar>
-            <w:top w:w="0" w:type="dxa"/>
-            <w:bottom w:w="0" w:type="dxa"/>
-          </w:tblCellMar>
-        </w:tblPrEx>
         <w:trPr>
           <w:cantSplit/>
         </w:trPr>
@@ -12759,12 +12441,6 @@
         </w:tc>
       </w:tr>
       <w:tr>
-        <w:tblPrEx>
-          <w:tblCellMar>
-            <w:top w:w="0" w:type="dxa"/>
-            <w:bottom w:w="0" w:type="dxa"/>
-          </w:tblCellMar>
-        </w:tblPrEx>
         <w:trPr>
           <w:cantSplit/>
         </w:trPr>
@@ -12815,12 +12491,6 @@
         </w:tc>
       </w:tr>
       <w:tr>
-        <w:tblPrEx>
-          <w:tblCellMar>
-            <w:top w:w="0" w:type="dxa"/>
-            <w:bottom w:w="0" w:type="dxa"/>
-          </w:tblCellMar>
-        </w:tblPrEx>
         <w:trPr>
           <w:cantSplit/>
         </w:trPr>
@@ -12871,12 +12541,6 @@
         </w:tc>
       </w:tr>
       <w:tr>
-        <w:tblPrEx>
-          <w:tblCellMar>
-            <w:top w:w="0" w:type="dxa"/>
-            <w:bottom w:w="0" w:type="dxa"/>
-          </w:tblCellMar>
-        </w:tblPrEx>
         <w:trPr>
           <w:cantSplit/>
         </w:trPr>
@@ -12927,12 +12591,6 @@
         </w:tc>
       </w:tr>
       <w:tr>
-        <w:tblPrEx>
-          <w:tblCellMar>
-            <w:top w:w="0" w:type="dxa"/>
-            <w:bottom w:w="0" w:type="dxa"/>
-          </w:tblCellMar>
-        </w:tblPrEx>
         <w:trPr>
           <w:cantSplit/>
         </w:trPr>
@@ -13372,12 +13030,6 @@
         <w:gridCol w:w="7000"/>
       </w:tblGrid>
       <w:tr>
-        <w:tblPrEx>
-          <w:tblCellMar>
-            <w:top w:w="0" w:type="dxa"/>
-            <w:bottom w:w="0" w:type="dxa"/>
-          </w:tblCellMar>
-        </w:tblPrEx>
         <w:trPr>
           <w:cantSplit/>
           <w:tblHeader/>
@@ -13434,12 +13086,6 @@
         </w:tc>
       </w:tr>
       <w:tr>
-        <w:tblPrEx>
-          <w:tblCellMar>
-            <w:top w:w="0" w:type="dxa"/>
-            <w:bottom w:w="0" w:type="dxa"/>
-          </w:tblCellMar>
-        </w:tblPrEx>
         <w:trPr>
           <w:cantSplit/>
         </w:trPr>
@@ -13490,12 +13136,6 @@
         </w:tc>
       </w:tr>
       <w:tr>
-        <w:tblPrEx>
-          <w:tblCellMar>
-            <w:top w:w="0" w:type="dxa"/>
-            <w:bottom w:w="0" w:type="dxa"/>
-          </w:tblCellMar>
-        </w:tblPrEx>
         <w:trPr>
           <w:cantSplit/>
         </w:trPr>
@@ -13546,12 +13186,6 @@
         </w:tc>
       </w:tr>
       <w:tr>
-        <w:tblPrEx>
-          <w:tblCellMar>
-            <w:top w:w="0" w:type="dxa"/>
-            <w:bottom w:w="0" w:type="dxa"/>
-          </w:tblCellMar>
-        </w:tblPrEx>
         <w:trPr>
           <w:cantSplit/>
         </w:trPr>
@@ -14497,12 +14131,6 @@
         <w:gridCol w:w="6500"/>
       </w:tblGrid>
       <w:tr>
-        <w:tblPrEx>
-          <w:tblCellMar>
-            <w:top w:w="0" w:type="dxa"/>
-            <w:bottom w:w="0" w:type="dxa"/>
-          </w:tblCellMar>
-        </w:tblPrEx>
         <w:trPr>
           <w:cantSplit/>
           <w:tblHeader/>
@@ -14559,12 +14187,6 @@
         </w:tc>
       </w:tr>
       <w:tr>
-        <w:tblPrEx>
-          <w:tblCellMar>
-            <w:top w:w="0" w:type="dxa"/>
-            <w:bottom w:w="0" w:type="dxa"/>
-          </w:tblCellMar>
-        </w:tblPrEx>
         <w:trPr>
           <w:cantSplit/>
         </w:trPr>
@@ -14615,12 +14237,6 @@
         </w:tc>
       </w:tr>
       <w:tr>
-        <w:tblPrEx>
-          <w:tblCellMar>
-            <w:top w:w="0" w:type="dxa"/>
-            <w:bottom w:w="0" w:type="dxa"/>
-          </w:tblCellMar>
-        </w:tblPrEx>
         <w:trPr>
           <w:cantSplit/>
         </w:trPr>
@@ -14671,12 +14287,6 @@
         </w:tc>
       </w:tr>
       <w:tr>
-        <w:tblPrEx>
-          <w:tblCellMar>
-            <w:top w:w="0" w:type="dxa"/>
-            <w:bottom w:w="0" w:type="dxa"/>
-          </w:tblCellMar>
-        </w:tblPrEx>
         <w:trPr>
           <w:cantSplit/>
         </w:trPr>
@@ -14727,12 +14337,6 @@
         </w:tc>
       </w:tr>
       <w:tr>
-        <w:tblPrEx>
-          <w:tblCellMar>
-            <w:top w:w="0" w:type="dxa"/>
-            <w:bottom w:w="0" w:type="dxa"/>
-          </w:tblCellMar>
-        </w:tblPrEx>
         <w:trPr>
           <w:cantSplit/>
         </w:trPr>
@@ -14828,12 +14432,6 @@
         <w:gridCol w:w="5300"/>
       </w:tblGrid>
       <w:tr>
-        <w:tblPrEx>
-          <w:tblCellMar>
-            <w:top w:w="0" w:type="dxa"/>
-            <w:bottom w:w="0" w:type="dxa"/>
-          </w:tblCellMar>
-        </w:tblPrEx>
         <w:trPr>
           <w:cantSplit/>
           <w:tblHeader/>
@@ -14890,12 +14488,6 @@
         </w:tc>
       </w:tr>
       <w:tr>
-        <w:tblPrEx>
-          <w:tblCellMar>
-            <w:top w:w="0" w:type="dxa"/>
-            <w:bottom w:w="0" w:type="dxa"/>
-          </w:tblCellMar>
-        </w:tblPrEx>
         <w:trPr>
           <w:cantSplit/>
         </w:trPr>
@@ -14946,12 +14538,6 @@
         </w:tc>
       </w:tr>
       <w:tr>
-        <w:tblPrEx>
-          <w:tblCellMar>
-            <w:top w:w="0" w:type="dxa"/>
-            <w:bottom w:w="0" w:type="dxa"/>
-          </w:tblCellMar>
-        </w:tblPrEx>
         <w:trPr>
           <w:cantSplit/>
         </w:trPr>
@@ -15002,12 +14588,6 @@
         </w:tc>
       </w:tr>
       <w:tr>
-        <w:tblPrEx>
-          <w:tblCellMar>
-            <w:top w:w="0" w:type="dxa"/>
-            <w:bottom w:w="0" w:type="dxa"/>
-          </w:tblCellMar>
-        </w:tblPrEx>
         <w:trPr>
           <w:cantSplit/>
         </w:trPr>
@@ -15058,12 +14638,6 @@
         </w:tc>
       </w:tr>
       <w:tr>
-        <w:tblPrEx>
-          <w:tblCellMar>
-            <w:top w:w="0" w:type="dxa"/>
-            <w:bottom w:w="0" w:type="dxa"/>
-          </w:tblCellMar>
-        </w:tblPrEx>
         <w:trPr>
           <w:cantSplit/>
         </w:trPr>
@@ -15114,12 +14688,6 @@
         </w:tc>
       </w:tr>
       <w:tr>
-        <w:tblPrEx>
-          <w:tblCellMar>
-            <w:top w:w="0" w:type="dxa"/>
-            <w:bottom w:w="0" w:type="dxa"/>
-          </w:tblCellMar>
-        </w:tblPrEx>
         <w:trPr>
           <w:cantSplit/>
         </w:trPr>
@@ -15333,19 +14901,31 @@
           <w:b/>
           <w:bCs/>
         </w:rPr>
-        <w:t xml:space="preserve"> Link: </w:t>
-      </w:r>
-      <w:r>
-        <w:t>[Insert demo URL, e.g., hosted on Render/</w:t>
-      </w:r>
-      <w:proofErr w:type="spellStart"/>
-      <w:r>
-        <w:t>Vercel</w:t>
-      </w:r>
-      <w:proofErr w:type="spellEnd"/>
-      <w:r>
-        <w:t>/Netlify]</w:t>
-      </w:r>
+        <w:t>:</w:t>
+      </w:r>
+      <w:r>
+        <w:t xml:space="preserve"> </w:t>
+      </w:r>
+      <w:hyperlink r:id="rId16" w:history="1">
+        <w:r>
+          <w:rPr>
+            <w:rStyle w:val="Hyperlink"/>
+          </w:rPr>
+          <w:t>https://drive.google.com/drive/folders/1</w:t>
+        </w:r>
+        <w:r>
+          <w:rPr>
+            <w:rStyle w:val="Hyperlink"/>
+          </w:rPr>
+          <w:t>b</w:t>
+        </w:r>
+        <w:r>
+          <w:rPr>
+            <w:rStyle w:val="Hyperlink"/>
+          </w:rPr>
+          <w:t>fZSg8LL15TeCGSCa89JyyR_GeFAVzfx</w:t>
+        </w:r>
+      </w:hyperlink>
     </w:p>
     <w:p>
       <w:pPr>
@@ -15363,9 +14943,26 @@
         </w:rPr>
         <w:t xml:space="preserve">GitHub Repository: </w:t>
       </w:r>
-      <w:r>
-        <w:t>[Insert repository URL]</w:t>
-      </w:r>
+      <w:hyperlink r:id="rId17" w:history="1">
+        <w:r>
+          <w:rPr>
+            <w:rStyle w:val="Hyperlink"/>
+          </w:rPr>
+          <w:t>https://github.com/saikotiadari/Sma</w:t>
+        </w:r>
+        <w:r>
+          <w:rPr>
+            <w:rStyle w:val="Hyperlink"/>
+          </w:rPr>
+          <w:t>r</w:t>
+        </w:r>
+        <w:r>
+          <w:rPr>
+            <w:rStyle w:val="Hyperlink"/>
+          </w:rPr>
+          <w:t>tBridge</w:t>
+        </w:r>
+      </w:hyperlink>
     </w:p>
     <w:p>
       <w:pPr>
@@ -15659,12 +15256,6 @@
         <w:gridCol w:w="1736"/>
       </w:tblGrid>
       <w:tr>
-        <w:tblPrEx>
-          <w:tblCellMar>
-            <w:top w:w="0" w:type="dxa"/>
-            <w:bottom w:w="0" w:type="dxa"/>
-          </w:tblCellMar>
-        </w:tblPrEx>
         <w:trPr>
           <w:cantSplit/>
           <w:tblHeader/>
@@ -15746,12 +15337,6 @@
         </w:tc>
       </w:tr>
       <w:tr>
-        <w:tblPrEx>
-          <w:tblCellMar>
-            <w:top w:w="0" w:type="dxa"/>
-            <w:bottom w:w="0" w:type="dxa"/>
-          </w:tblCellMar>
-        </w:tblPrEx>
         <w:trPr>
           <w:cantSplit/>
         </w:trPr>
@@ -15824,12 +15409,6 @@
         </w:tc>
       </w:tr>
       <w:tr>
-        <w:tblPrEx>
-          <w:tblCellMar>
-            <w:top w:w="0" w:type="dxa"/>
-            <w:bottom w:w="0" w:type="dxa"/>
-          </w:tblCellMar>
-        </w:tblPrEx>
         <w:trPr>
           <w:cantSplit/>
         </w:trPr>
@@ -15920,12 +15499,6 @@
         </w:tc>
       </w:tr>
       <w:tr>
-        <w:tblPrEx>
-          <w:tblCellMar>
-            <w:top w:w="0" w:type="dxa"/>
-            <w:bottom w:w="0" w:type="dxa"/>
-          </w:tblCellMar>
-        </w:tblPrEx>
         <w:trPr>
           <w:cantSplit/>
         </w:trPr>
@@ -16053,12 +15626,6 @@
         <w:gridCol w:w="1700"/>
       </w:tblGrid>
       <w:tr>
-        <w:tblPrEx>
-          <w:tblCellMar>
-            <w:top w:w="0" w:type="dxa"/>
-            <w:bottom w:w="0" w:type="dxa"/>
-          </w:tblCellMar>
-        </w:tblPrEx>
         <w:trPr>
           <w:cantSplit/>
           <w:tblHeader/>
@@ -16140,12 +15707,6 @@
         </w:tc>
       </w:tr>
       <w:tr>
-        <w:tblPrEx>
-          <w:tblCellMar>
-            <w:top w:w="0" w:type="dxa"/>
-            <w:bottom w:w="0" w:type="dxa"/>
-          </w:tblCellMar>
-        </w:tblPrEx>
         <w:trPr>
           <w:cantSplit/>
         </w:trPr>
@@ -16229,12 +15790,6 @@
         </w:tc>
       </w:tr>
       <w:tr>
-        <w:tblPrEx>
-          <w:tblCellMar>
-            <w:top w:w="0" w:type="dxa"/>
-            <w:bottom w:w="0" w:type="dxa"/>
-          </w:tblCellMar>
-        </w:tblPrEx>
         <w:trPr>
           <w:cantSplit/>
         </w:trPr>
@@ -16318,12 +15873,6 @@
         </w:tc>
       </w:tr>
       <w:tr>
-        <w:tblPrEx>
-          <w:tblCellMar>
-            <w:top w:w="0" w:type="dxa"/>
-            <w:bottom w:w="0" w:type="dxa"/>
-          </w:tblCellMar>
-        </w:tblPrEx>
         <w:trPr>
           <w:cantSplit/>
         </w:trPr>
@@ -16407,12 +15956,6 @@
         </w:tc>
       </w:tr>
       <w:tr>
-        <w:tblPrEx>
-          <w:tblCellMar>
-            <w:top w:w="0" w:type="dxa"/>
-            <w:bottom w:w="0" w:type="dxa"/>
-          </w:tblCellMar>
-        </w:tblPrEx>
         <w:trPr>
           <w:cantSplit/>
         </w:trPr>
@@ -16496,12 +16039,6 @@
         </w:tc>
       </w:tr>
       <w:tr>
-        <w:tblPrEx>
-          <w:tblCellMar>
-            <w:top w:w="0" w:type="dxa"/>
-            <w:bottom w:w="0" w:type="dxa"/>
-          </w:tblCellMar>
-        </w:tblPrEx>
         <w:trPr>
           <w:cantSplit/>
         </w:trPr>
@@ -16585,12 +16122,6 @@
         </w:tc>
       </w:tr>
       <w:tr>
-        <w:tblPrEx>
-          <w:tblCellMar>
-            <w:top w:w="0" w:type="dxa"/>
-            <w:bottom w:w="0" w:type="dxa"/>
-          </w:tblCellMar>
-        </w:tblPrEx>
         <w:trPr>
           <w:cantSplit/>
         </w:trPr>
@@ -16674,12 +16205,6 @@
         </w:tc>
       </w:tr>
       <w:tr>
-        <w:tblPrEx>
-          <w:tblCellMar>
-            <w:top w:w="0" w:type="dxa"/>
-            <w:bottom w:w="0" w:type="dxa"/>
-          </w:tblCellMar>
-        </w:tblPrEx>
         <w:trPr>
           <w:cantSplit/>
         </w:trPr>
@@ -16798,12 +16323,6 @@
         <w:gridCol w:w="6500"/>
       </w:tblGrid>
       <w:tr>
-        <w:tblPrEx>
-          <w:tblCellMar>
-            <w:top w:w="0" w:type="dxa"/>
-            <w:bottom w:w="0" w:type="dxa"/>
-          </w:tblCellMar>
-        </w:tblPrEx>
         <w:trPr>
           <w:cantSplit/>
           <w:tblHeader/>
@@ -16860,12 +16379,6 @@
         </w:tc>
       </w:tr>
       <w:tr>
-        <w:tblPrEx>
-          <w:tblCellMar>
-            <w:top w:w="0" w:type="dxa"/>
-            <w:bottom w:w="0" w:type="dxa"/>
-          </w:tblCellMar>
-        </w:tblPrEx>
         <w:trPr>
           <w:cantSplit/>
         </w:trPr>
@@ -16916,12 +16429,6 @@
         </w:tc>
       </w:tr>
       <w:tr>
-        <w:tblPrEx>
-          <w:tblCellMar>
-            <w:top w:w="0" w:type="dxa"/>
-            <w:bottom w:w="0" w:type="dxa"/>
-          </w:tblCellMar>
-        </w:tblPrEx>
         <w:trPr>
           <w:cantSplit/>
         </w:trPr>
@@ -16972,12 +16479,6 @@
         </w:tc>
       </w:tr>
       <w:tr>
-        <w:tblPrEx>
-          <w:tblCellMar>
-            <w:top w:w="0" w:type="dxa"/>
-            <w:bottom w:w="0" w:type="dxa"/>
-          </w:tblCellMar>
-        </w:tblPrEx>
         <w:trPr>
           <w:cantSplit/>
         </w:trPr>
@@ -17028,12 +16529,6 @@
         </w:tc>
       </w:tr>
       <w:tr>
-        <w:tblPrEx>
-          <w:tblCellMar>
-            <w:top w:w="0" w:type="dxa"/>
-            <w:bottom w:w="0" w:type="dxa"/>
-          </w:tblCellMar>
-        </w:tblPrEx>
         <w:trPr>
           <w:cantSplit/>
         </w:trPr>
@@ -17104,12 +16599,6 @@
         </w:tc>
       </w:tr>
       <w:tr>
-        <w:tblPrEx>
-          <w:tblCellMar>
-            <w:top w:w="0" w:type="dxa"/>
-            <w:bottom w:w="0" w:type="dxa"/>
-          </w:tblCellMar>
-        </w:tblPrEx>
         <w:trPr>
           <w:cantSplit/>
         </w:trPr>
@@ -17160,12 +16649,6 @@
         </w:tc>
       </w:tr>
       <w:tr>
-        <w:tblPrEx>
-          <w:tblCellMar>
-            <w:top w:w="0" w:type="dxa"/>
-            <w:bottom w:w="0" w:type="dxa"/>
-          </w:tblCellMar>
-        </w:tblPrEx>
         <w:trPr>
           <w:cantSplit/>
         </w:trPr>
@@ -17219,12 +16702,6 @@
         </w:tc>
       </w:tr>
       <w:tr>
-        <w:tblPrEx>
-          <w:tblCellMar>
-            <w:top w:w="0" w:type="dxa"/>
-            <w:bottom w:w="0" w:type="dxa"/>
-          </w:tblCellMar>
-        </w:tblPrEx>
         <w:trPr>
           <w:cantSplit/>
         </w:trPr>
@@ -17275,12 +16752,6 @@
         </w:tc>
       </w:tr>
       <w:tr>
-        <w:tblPrEx>
-          <w:tblCellMar>
-            <w:top w:w="0" w:type="dxa"/>
-            <w:bottom w:w="0" w:type="dxa"/>
-          </w:tblCellMar>
-        </w:tblPrEx>
         <w:trPr>
           <w:cantSplit/>
         </w:trPr>
@@ -17433,8 +16904,8 @@
       </w:r>
     </w:p>
     <w:sectPr>
-      <w:headerReference w:type="default" r:id="rId16"/>
-      <w:footerReference w:type="default" r:id="rId17"/>
+      <w:headerReference w:type="default" r:id="rId18"/>
+      <w:footerReference w:type="default" r:id="rId19"/>
       <w:pgSz w:w="12240" w:h="15840"/>
       <w:pgMar w:top="1080" w:right="1260" w:bottom="1080" w:left="1260" w:header="708" w:footer="708" w:gutter="0"/>
       <w:cols w:space="720"/>
@@ -18346,6 +17817,30 @@
       <w:ind w:left="440"/>
     </w:pPr>
   </w:style>
+  <w:style w:type="character" w:styleId="UnresolvedMention">
+    <w:name w:val="Unresolved Mention"/>
+    <w:basedOn w:val="DefaultParagraphFont"/>
+    <w:uiPriority w:val="99"/>
+    <w:semiHidden/>
+    <w:unhideWhenUsed/>
+    <w:rsid w:val="00E867AF"/>
+    <w:rPr>
+      <w:color w:val="605E5C"/>
+      <w:shd w:val="clear" w:color="auto" w:fill="E1DFDD"/>
+    </w:rPr>
+  </w:style>
+  <w:style w:type="character" w:styleId="FollowedHyperlink">
+    <w:name w:val="FollowedHyperlink"/>
+    <w:basedOn w:val="DefaultParagraphFont"/>
+    <w:uiPriority w:val="99"/>
+    <w:semiHidden/>
+    <w:unhideWhenUsed/>
+    <w:rsid w:val="00E867AF"/>
+    <w:rPr>
+      <w:color w:val="96607D" w:themeColor="followedHyperlink"/>
+      <w:u w:val="single"/>
+    </w:rPr>
+  </w:style>
 </w:styles>
 </file>
 

</xml_diff>